<commit_message>
preparando base de casos de uso do doc de requisitos
</commit_message>
<xml_diff>
--- a/Documents/TaskFlow_DocumentoDeRequisitos.docx
+++ b/Documents/TaskFlow_DocumentoDeRequisitos.docx
@@ -268,7 +268,43 @@
                 <w:sz w:val="18"/>
                 <w:szCs w:val="18"/>
               </w:rPr>
-              <w:t>iOS e Android (React Native / Expo)</w:t>
+              <w:t>iOS e Android (</w:t>
+            </w:r>
+            <w:proofErr w:type="spellStart"/>
+            <w:r>
+              <w:rPr>
+                <w:color w:val="000000"/>
+                <w:sz w:val="18"/>
+                <w:szCs w:val="18"/>
+              </w:rPr>
+              <w:t>React</w:t>
+            </w:r>
+            <w:proofErr w:type="spellEnd"/>
+            <w:r>
+              <w:rPr>
+                <w:color w:val="000000"/>
+                <w:sz w:val="18"/>
+                <w:szCs w:val="18"/>
+              </w:rPr>
+              <w:t xml:space="preserve"> </w:t>
+            </w:r>
+            <w:proofErr w:type="spellStart"/>
+            <w:r>
+              <w:rPr>
+                <w:color w:val="000000"/>
+                <w:sz w:val="18"/>
+                <w:szCs w:val="18"/>
+              </w:rPr>
+              <w:t>Native</w:t>
+            </w:r>
+            <w:proofErr w:type="spellEnd"/>
+            <w:r>
+              <w:rPr>
+                <w:color w:val="000000"/>
+                <w:sz w:val="18"/>
+                <w:szCs w:val="18"/>
+              </w:rPr>
+              <w:t xml:space="preserve"> / Expo)</w:t>
             </w:r>
           </w:p>
         </w:tc>
@@ -388,7 +424,25 @@
                 <w:sz w:val="18"/>
                 <w:szCs w:val="18"/>
               </w:rPr>
-              <w:t>Março a Junho 2026</w:t>
+              <w:t xml:space="preserve">Março a </w:t>
+            </w:r>
+            <w:proofErr w:type="gramStart"/>
+            <w:r>
+              <w:rPr>
+                <w:color w:val="000000"/>
+                <w:sz w:val="18"/>
+                <w:szCs w:val="18"/>
+              </w:rPr>
+              <w:t>Junho</w:t>
+            </w:r>
+            <w:proofErr w:type="gramEnd"/>
+            <w:r>
+              <w:rPr>
+                <w:color w:val="000000"/>
+                <w:sz w:val="18"/>
+                <w:szCs w:val="18"/>
+              </w:rPr>
+              <w:t xml:space="preserve"> 2026</w:t>
             </w:r>
           </w:p>
         </w:tc>
@@ -878,7 +932,25 @@
                 <w:sz w:val="18"/>
                 <w:szCs w:val="18"/>
               </w:rPr>
-              <w:t>Vinicius Ryosuke Otsuka</w:t>
+              <w:t xml:space="preserve">Vinicius </w:t>
+            </w:r>
+            <w:proofErr w:type="spellStart"/>
+            <w:r>
+              <w:rPr>
+                <w:color w:val="000000"/>
+                <w:sz w:val="18"/>
+                <w:szCs w:val="18"/>
+              </w:rPr>
+              <w:t>Ryosuke</w:t>
+            </w:r>
+            <w:proofErr w:type="spellEnd"/>
+            <w:r>
+              <w:rPr>
+                <w:color w:val="000000"/>
+                <w:sz w:val="18"/>
+                <w:szCs w:val="18"/>
+              </w:rPr>
+              <w:t xml:space="preserve"> Otsuka</w:t>
             </w:r>
           </w:p>
         </w:tc>
@@ -949,7 +1021,49 @@
         <w:rPr>
           <w:color w:val="000000"/>
         </w:rPr>
-        <w:t>Este documento especifica os requisitos do sistema TaskFlow, um aplicativo móvel de produtividade que combina gerenciamento de tarefas com a técnica Pomodoro. O documento cobre o projeto completo, organizado em dois semestres acadêmicos (Março a Junho 2026 / 2º Semestre 2026), e serve como referência técnica para toda a equipe de desenvolvimento.</w:t>
+        <w:t xml:space="preserve">Este documento especifica os requisitos do sistema </w:t>
+      </w:r>
+      <w:proofErr w:type="spellStart"/>
+      <w:r>
+        <w:rPr>
+          <w:color w:val="000000"/>
+        </w:rPr>
+        <w:t>TaskFlow</w:t>
+      </w:r>
+      <w:proofErr w:type="spellEnd"/>
+      <w:r>
+        <w:rPr>
+          <w:color w:val="000000"/>
+        </w:rPr>
+        <w:t>, um aplicativo móvel de produtividade que combina gerenciamento de tarefas com a técnica Pomodoro. O documento cobre o projeto completo, organizado em dois semestres acadêmicos (</w:t>
+      </w:r>
+      <w:proofErr w:type="gramStart"/>
+      <w:r>
+        <w:rPr>
+          <w:color w:val="000000"/>
+        </w:rPr>
+        <w:t>Março</w:t>
+      </w:r>
+      <w:proofErr w:type="gramEnd"/>
+      <w:r>
+        <w:rPr>
+          <w:color w:val="000000"/>
+        </w:rPr>
+        <w:t xml:space="preserve"> a </w:t>
+      </w:r>
+      <w:proofErr w:type="gramStart"/>
+      <w:r>
+        <w:rPr>
+          <w:color w:val="000000"/>
+        </w:rPr>
+        <w:t>Junho</w:t>
+      </w:r>
+      <w:proofErr w:type="gramEnd"/>
+      <w:r>
+        <w:rPr>
+          <w:color w:val="000000"/>
+        </w:rPr>
+        <w:t xml:space="preserve"> 2026 / 2º Semestre 2026), e serve como referência técnica para toda a equipe de desenvolvimento.</w:t>
       </w:r>
     </w:p>
     <w:p>
@@ -1347,7 +1461,43 @@
                 <w:sz w:val="18"/>
                 <w:szCs w:val="18"/>
               </w:rPr>
-              <w:t>O sistema deve permitir login com Google OAuth via Supabase.</w:t>
+              <w:t xml:space="preserve">O sistema deve permitir login com Google </w:t>
+            </w:r>
+            <w:proofErr w:type="spellStart"/>
+            <w:r>
+              <w:rPr>
+                <w:color w:val="000000"/>
+                <w:sz w:val="18"/>
+                <w:szCs w:val="18"/>
+              </w:rPr>
+              <w:t>OAuth</w:t>
+            </w:r>
+            <w:proofErr w:type="spellEnd"/>
+            <w:r>
+              <w:rPr>
+                <w:color w:val="000000"/>
+                <w:sz w:val="18"/>
+                <w:szCs w:val="18"/>
+              </w:rPr>
+              <w:t xml:space="preserve"> via </w:t>
+            </w:r>
+            <w:proofErr w:type="spellStart"/>
+            <w:r>
+              <w:rPr>
+                <w:color w:val="000000"/>
+                <w:sz w:val="18"/>
+                <w:szCs w:val="18"/>
+              </w:rPr>
+              <w:t>Supabase</w:t>
+            </w:r>
+            <w:proofErr w:type="spellEnd"/>
+            <w:r>
+              <w:rPr>
+                <w:color w:val="000000"/>
+                <w:sz w:val="18"/>
+                <w:szCs w:val="18"/>
+              </w:rPr>
+              <w:t>.</w:t>
             </w:r>
           </w:p>
         </w:tc>
@@ -1499,7 +1649,43 @@
                 <w:sz w:val="18"/>
                 <w:szCs w:val="18"/>
               </w:rPr>
-              <w:t>O sistema deve permitir login com Apple OAuth via Supabase.</w:t>
+              <w:t xml:space="preserve">O sistema deve permitir login com Apple </w:t>
+            </w:r>
+            <w:proofErr w:type="spellStart"/>
+            <w:r>
+              <w:rPr>
+                <w:color w:val="000000"/>
+                <w:sz w:val="18"/>
+                <w:szCs w:val="18"/>
+              </w:rPr>
+              <w:t>OAuth</w:t>
+            </w:r>
+            <w:proofErr w:type="spellEnd"/>
+            <w:r>
+              <w:rPr>
+                <w:color w:val="000000"/>
+                <w:sz w:val="18"/>
+                <w:szCs w:val="18"/>
+              </w:rPr>
+              <w:t xml:space="preserve"> via </w:t>
+            </w:r>
+            <w:proofErr w:type="spellStart"/>
+            <w:r>
+              <w:rPr>
+                <w:color w:val="000000"/>
+                <w:sz w:val="18"/>
+                <w:szCs w:val="18"/>
+              </w:rPr>
+              <w:t>Supabase</w:t>
+            </w:r>
+            <w:proofErr w:type="spellEnd"/>
+            <w:r>
+              <w:rPr>
+                <w:color w:val="000000"/>
+                <w:sz w:val="18"/>
+                <w:szCs w:val="18"/>
+              </w:rPr>
+              <w:t>.</w:t>
             </w:r>
           </w:p>
         </w:tc>
@@ -2715,7 +2901,25 @@
                 <w:sz w:val="18"/>
                 <w:szCs w:val="18"/>
               </w:rPr>
-              <w:t>O sistema deve sincronizar tarefas com Supabase ao reconectar à internet.</w:t>
+              <w:t xml:space="preserve">O sistema deve sincronizar tarefas com </w:t>
+            </w:r>
+            <w:proofErr w:type="spellStart"/>
+            <w:r>
+              <w:rPr>
+                <w:color w:val="000000"/>
+                <w:sz w:val="18"/>
+                <w:szCs w:val="18"/>
+              </w:rPr>
+              <w:t>Supabase</w:t>
+            </w:r>
+            <w:proofErr w:type="spellEnd"/>
+            <w:r>
+              <w:rPr>
+                <w:color w:val="000000"/>
+                <w:sz w:val="18"/>
+                <w:szCs w:val="18"/>
+              </w:rPr>
+              <w:t xml:space="preserve"> ao reconectar à internet.</w:t>
             </w:r>
           </w:p>
         </w:tc>
@@ -3627,7 +3831,25 @@
                 <w:sz w:val="18"/>
                 <w:szCs w:val="18"/>
               </w:rPr>
-              <w:t>O sistema deve sincronizar sessões com Supabase.</w:t>
+              <w:t xml:space="preserve">O sistema deve sincronizar sessões com </w:t>
+            </w:r>
+            <w:proofErr w:type="spellStart"/>
+            <w:r>
+              <w:rPr>
+                <w:color w:val="000000"/>
+                <w:sz w:val="18"/>
+                <w:szCs w:val="18"/>
+              </w:rPr>
+              <w:t>Supabase</w:t>
+            </w:r>
+            <w:proofErr w:type="spellEnd"/>
+            <w:r>
+              <w:rPr>
+                <w:color w:val="000000"/>
+                <w:sz w:val="18"/>
+                <w:szCs w:val="18"/>
+              </w:rPr>
+              <w:t>.</w:t>
             </w:r>
           </w:p>
         </w:tc>
@@ -3780,7 +4002,25 @@
                 <w:sz w:val="18"/>
                 <w:szCs w:val="18"/>
               </w:rPr>
-              <w:t>O sistema deve exibir countdown de 25 minutos de foco e 5 minutos de pausa.</w:t>
+              <w:t xml:space="preserve">O sistema deve exibir </w:t>
+            </w:r>
+            <w:proofErr w:type="spellStart"/>
+            <w:r>
+              <w:rPr>
+                <w:color w:val="000000"/>
+                <w:sz w:val="18"/>
+                <w:szCs w:val="18"/>
+              </w:rPr>
+              <w:t>countdown</w:t>
+            </w:r>
+            <w:proofErr w:type="spellEnd"/>
+            <w:r>
+              <w:rPr>
+                <w:color w:val="000000"/>
+                <w:sz w:val="18"/>
+                <w:szCs w:val="18"/>
+              </w:rPr>
+              <w:t xml:space="preserve"> de 25 minutos de foco e 5 minutos de pausa.</w:t>
             </w:r>
           </w:p>
         </w:tc>
@@ -4236,7 +4476,25 @@
                 <w:sz w:val="18"/>
                 <w:szCs w:val="18"/>
               </w:rPr>
-              <w:t>O sistema deve funcionar em background usando timestamp de início salvo.</w:t>
+              <w:t xml:space="preserve">O sistema deve funcionar em background usando </w:t>
+            </w:r>
+            <w:proofErr w:type="spellStart"/>
+            <w:r>
+              <w:rPr>
+                <w:color w:val="000000"/>
+                <w:sz w:val="18"/>
+                <w:szCs w:val="18"/>
+              </w:rPr>
+              <w:t>timestamp</w:t>
+            </w:r>
+            <w:proofErr w:type="spellEnd"/>
+            <w:r>
+              <w:rPr>
+                <w:color w:val="000000"/>
+                <w:sz w:val="18"/>
+                <w:szCs w:val="18"/>
+              </w:rPr>
+              <w:t xml:space="preserve"> de início salvo.</w:t>
             </w:r>
           </w:p>
         </w:tc>
@@ -4692,7 +4950,25 @@
                 <w:sz w:val="18"/>
                 <w:szCs w:val="18"/>
               </w:rPr>
-              <w:t>O sistema deve exibir gráfico de produtividade semanal com Victory Native.</w:t>
+              <w:t xml:space="preserve">O sistema deve exibir gráfico de produtividade semanal com Victory </w:t>
+            </w:r>
+            <w:proofErr w:type="spellStart"/>
+            <w:r>
+              <w:rPr>
+                <w:color w:val="000000"/>
+                <w:sz w:val="18"/>
+                <w:szCs w:val="18"/>
+              </w:rPr>
+              <w:t>Native</w:t>
+            </w:r>
+            <w:proofErr w:type="spellEnd"/>
+            <w:r>
+              <w:rPr>
+                <w:color w:val="000000"/>
+                <w:sz w:val="18"/>
+                <w:szCs w:val="18"/>
+              </w:rPr>
+              <w:t>.</w:t>
             </w:r>
           </w:p>
         </w:tc>
@@ -5791,7 +6067,61 @@
                 <w:sz w:val="18"/>
                 <w:szCs w:val="18"/>
               </w:rPr>
-              <w:t>Cada usuário visualiza exclusivamente seus próprios dados. O isolamento é garantido por RLS (Row Level Security) no Supabase, vinculado ao user_id autenticado.</w:t>
+              <w:t xml:space="preserve">Cada usuário visualiza exclusivamente seus próprios dados. O isolamento é garantido por RLS (Row </w:t>
+            </w:r>
+            <w:proofErr w:type="spellStart"/>
+            <w:r>
+              <w:rPr>
+                <w:color w:val="000000"/>
+                <w:sz w:val="18"/>
+                <w:szCs w:val="18"/>
+              </w:rPr>
+              <w:t>Level</w:t>
+            </w:r>
+            <w:proofErr w:type="spellEnd"/>
+            <w:r>
+              <w:rPr>
+                <w:color w:val="000000"/>
+                <w:sz w:val="18"/>
+                <w:szCs w:val="18"/>
+              </w:rPr>
+              <w:t xml:space="preserve"> Security) no </w:t>
+            </w:r>
+            <w:proofErr w:type="spellStart"/>
+            <w:r>
+              <w:rPr>
+                <w:color w:val="000000"/>
+                <w:sz w:val="18"/>
+                <w:szCs w:val="18"/>
+              </w:rPr>
+              <w:t>Supabase</w:t>
+            </w:r>
+            <w:proofErr w:type="spellEnd"/>
+            <w:r>
+              <w:rPr>
+                <w:color w:val="000000"/>
+                <w:sz w:val="18"/>
+                <w:szCs w:val="18"/>
+              </w:rPr>
+              <w:t xml:space="preserve">, vinculado ao </w:t>
+            </w:r>
+            <w:proofErr w:type="spellStart"/>
+            <w:r>
+              <w:rPr>
+                <w:color w:val="000000"/>
+                <w:sz w:val="18"/>
+                <w:szCs w:val="18"/>
+              </w:rPr>
+              <w:t>user_id</w:t>
+            </w:r>
+            <w:proofErr w:type="spellEnd"/>
+            <w:r>
+              <w:rPr>
+                <w:color w:val="000000"/>
+                <w:sz w:val="18"/>
+                <w:szCs w:val="18"/>
+              </w:rPr>
+              <w:t xml:space="preserve"> autenticado.</w:t>
             </w:r>
           </w:p>
         </w:tc>
@@ -5853,8 +6183,20 @@
                 <w:sz w:val="18"/>
                 <w:szCs w:val="18"/>
               </w:rPr>
-              <w:t>Autenticação exclusiva por OAuth</w:t>
-            </w:r>
+              <w:t xml:space="preserve">Autenticação exclusiva por </w:t>
+            </w:r>
+            <w:proofErr w:type="spellStart"/>
+            <w:r>
+              <w:rPr>
+                <w:b/>
+                <w:bCs/>
+                <w:color w:val="000000"/>
+                <w:sz w:val="18"/>
+                <w:szCs w:val="18"/>
+              </w:rPr>
+              <w:t>OAuth</w:t>
+            </w:r>
+            <w:proofErr w:type="spellEnd"/>
           </w:p>
         </w:tc>
         <w:tc>
@@ -5912,7 +6254,43 @@
                 <w:sz w:val="18"/>
                 <w:szCs w:val="18"/>
               </w:rPr>
-              <w:t>Não é permitido criar contas locais ou login por email/senha. O acesso ao sistema exige autenticação via Google ou Apple OAuth.</w:t>
+              <w:t xml:space="preserve">Não é permitido criar contas locais ou login por </w:t>
+            </w:r>
+            <w:proofErr w:type="spellStart"/>
+            <w:r>
+              <w:rPr>
+                <w:color w:val="000000"/>
+                <w:sz w:val="18"/>
+                <w:szCs w:val="18"/>
+              </w:rPr>
+              <w:t>email</w:t>
+            </w:r>
+            <w:proofErr w:type="spellEnd"/>
+            <w:r>
+              <w:rPr>
+                <w:color w:val="000000"/>
+                <w:sz w:val="18"/>
+                <w:szCs w:val="18"/>
+              </w:rPr>
+              <w:t xml:space="preserve">/senha. O acesso ao sistema exige autenticação via Google ou Apple </w:t>
+            </w:r>
+            <w:proofErr w:type="spellStart"/>
+            <w:r>
+              <w:rPr>
+                <w:color w:val="000000"/>
+                <w:sz w:val="18"/>
+                <w:szCs w:val="18"/>
+              </w:rPr>
+              <w:t>OAuth</w:t>
+            </w:r>
+            <w:proofErr w:type="spellEnd"/>
+            <w:r>
+              <w:rPr>
+                <w:color w:val="000000"/>
+                <w:sz w:val="18"/>
+                <w:szCs w:val="18"/>
+              </w:rPr>
+              <w:t>.</w:t>
             </w:r>
           </w:p>
         </w:tc>
@@ -5974,8 +6352,20 @@
                 <w:sz w:val="18"/>
                 <w:szCs w:val="18"/>
               </w:rPr>
-              <w:t>Offline-first</w:t>
-            </w:r>
+              <w:t>Offline-</w:t>
+            </w:r>
+            <w:proofErr w:type="spellStart"/>
+            <w:r>
+              <w:rPr>
+                <w:b/>
+                <w:bCs/>
+                <w:color w:val="000000"/>
+                <w:sz w:val="18"/>
+                <w:szCs w:val="18"/>
+              </w:rPr>
+              <w:t>first</w:t>
+            </w:r>
+            <w:proofErr w:type="spellEnd"/>
           </w:p>
         </w:tc>
         <w:tc>
@@ -6033,7 +6423,43 @@
                 <w:sz w:val="18"/>
                 <w:szCs w:val="18"/>
               </w:rPr>
-              <w:t>Toda operação de leitura e escrita deve ocorrer primeiro no SQLite local. A sincronização com Supabase é assíncrona e ocorre automaticamente ao reconectar.</w:t>
+              <w:t xml:space="preserve">Toda operação de leitura e escrita deve ocorrer primeiro no </w:t>
+            </w:r>
+            <w:proofErr w:type="spellStart"/>
+            <w:r>
+              <w:rPr>
+                <w:color w:val="000000"/>
+                <w:sz w:val="18"/>
+                <w:szCs w:val="18"/>
+              </w:rPr>
+              <w:t>SQLite</w:t>
+            </w:r>
+            <w:proofErr w:type="spellEnd"/>
+            <w:r>
+              <w:rPr>
+                <w:color w:val="000000"/>
+                <w:sz w:val="18"/>
+                <w:szCs w:val="18"/>
+              </w:rPr>
+              <w:t xml:space="preserve"> local. A sincronização com </w:t>
+            </w:r>
+            <w:proofErr w:type="spellStart"/>
+            <w:r>
+              <w:rPr>
+                <w:color w:val="000000"/>
+                <w:sz w:val="18"/>
+                <w:szCs w:val="18"/>
+              </w:rPr>
+              <w:t>Supabase</w:t>
+            </w:r>
+            <w:proofErr w:type="spellEnd"/>
+            <w:r>
+              <w:rPr>
+                <w:color w:val="000000"/>
+                <w:sz w:val="18"/>
+                <w:szCs w:val="18"/>
+              </w:rPr>
+              <w:t xml:space="preserve"> é assíncrona e ocorre automaticamente ao reconectar.</w:t>
             </w:r>
           </w:p>
         </w:tc>
@@ -6095,8 +6521,20 @@
                 <w:sz w:val="18"/>
                 <w:szCs w:val="18"/>
               </w:rPr>
-              <w:t>Estratégia de conflito last-write-wins</w:t>
-            </w:r>
+              <w:t xml:space="preserve">Estratégia de conflito </w:t>
+            </w:r>
+            <w:proofErr w:type="spellStart"/>
+            <w:r>
+              <w:rPr>
+                <w:b/>
+                <w:bCs/>
+                <w:color w:val="000000"/>
+                <w:sz w:val="18"/>
+                <w:szCs w:val="18"/>
+              </w:rPr>
+              <w:t>last-write-wins</w:t>
+            </w:r>
+            <w:proofErr w:type="spellEnd"/>
           </w:p>
         </w:tc>
         <w:tc>
@@ -6154,7 +6592,43 @@
                 <w:sz w:val="18"/>
                 <w:szCs w:val="18"/>
               </w:rPr>
-              <w:t>Conflitos de sincronização são resolvidos pelo campo updated_at. O registro com timestamp mais recente prevalece, sem intervenção do usuário.</w:t>
+              <w:t xml:space="preserve">Conflitos de sincronização são resolvidos pelo campo </w:t>
+            </w:r>
+            <w:proofErr w:type="spellStart"/>
+            <w:r>
+              <w:rPr>
+                <w:color w:val="000000"/>
+                <w:sz w:val="18"/>
+                <w:szCs w:val="18"/>
+              </w:rPr>
+              <w:t>updated_at</w:t>
+            </w:r>
+            <w:proofErr w:type="spellEnd"/>
+            <w:r>
+              <w:rPr>
+                <w:color w:val="000000"/>
+                <w:sz w:val="18"/>
+                <w:szCs w:val="18"/>
+              </w:rPr>
+              <w:t xml:space="preserve">. O registro com </w:t>
+            </w:r>
+            <w:proofErr w:type="spellStart"/>
+            <w:r>
+              <w:rPr>
+                <w:color w:val="000000"/>
+                <w:sz w:val="18"/>
+                <w:szCs w:val="18"/>
+              </w:rPr>
+              <w:t>timestamp</w:t>
+            </w:r>
+            <w:proofErr w:type="spellEnd"/>
+            <w:r>
+              <w:rPr>
+                <w:color w:val="000000"/>
+                <w:sz w:val="18"/>
+                <w:szCs w:val="18"/>
+              </w:rPr>
+              <w:t xml:space="preserve"> mais recente prevalece, sem intervenção do usuário.</w:t>
             </w:r>
           </w:p>
         </w:tc>
@@ -6275,7 +6749,25 @@
                 <w:sz w:val="18"/>
                 <w:szCs w:val="18"/>
               </w:rPr>
-              <w:t>Ao concluir uma sessão de foco, o campo completed_pomodoros da tarefa vinculada deve ser incrementado automaticamente.</w:t>
+              <w:t xml:space="preserve">Ao concluir uma sessão de foco, o campo </w:t>
+            </w:r>
+            <w:proofErr w:type="spellStart"/>
+            <w:r>
+              <w:rPr>
+                <w:color w:val="000000"/>
+                <w:sz w:val="18"/>
+                <w:szCs w:val="18"/>
+              </w:rPr>
+              <w:t>completed_pomodoros</w:t>
+            </w:r>
+            <w:proofErr w:type="spellEnd"/>
+            <w:r>
+              <w:rPr>
+                <w:color w:val="000000"/>
+                <w:sz w:val="18"/>
+                <w:szCs w:val="18"/>
+              </w:rPr>
+              <w:t xml:space="preserve"> da tarefa vinculada deve ser incrementado automaticamente.</w:t>
             </w:r>
           </w:p>
         </w:tc>
@@ -6396,7 +6888,97 @@
                 <w:sz w:val="18"/>
                 <w:szCs w:val="18"/>
               </w:rPr>
-              <w:t>Nenhuma tela (UI Layer) deve conter lógica de negócio. Toda regra de domínio reside nos Zustand stores (taskStore, timerStore, authStore).</w:t>
+              <w:t xml:space="preserve">Nenhuma tela (UI </w:t>
+            </w:r>
+            <w:proofErr w:type="spellStart"/>
+            <w:r>
+              <w:rPr>
+                <w:color w:val="000000"/>
+                <w:sz w:val="18"/>
+                <w:szCs w:val="18"/>
+              </w:rPr>
+              <w:t>Layer</w:t>
+            </w:r>
+            <w:proofErr w:type="spellEnd"/>
+            <w:r>
+              <w:rPr>
+                <w:color w:val="000000"/>
+                <w:sz w:val="18"/>
+                <w:szCs w:val="18"/>
+              </w:rPr>
+              <w:t xml:space="preserve">) deve conter lógica de negócio. Toda regra de domínio reside nos </w:t>
+            </w:r>
+            <w:proofErr w:type="spellStart"/>
+            <w:r>
+              <w:rPr>
+                <w:color w:val="000000"/>
+                <w:sz w:val="18"/>
+                <w:szCs w:val="18"/>
+              </w:rPr>
+              <w:t>Zustand</w:t>
+            </w:r>
+            <w:proofErr w:type="spellEnd"/>
+            <w:r>
+              <w:rPr>
+                <w:color w:val="000000"/>
+                <w:sz w:val="18"/>
+                <w:szCs w:val="18"/>
+              </w:rPr>
+              <w:t xml:space="preserve"> stores (</w:t>
+            </w:r>
+            <w:proofErr w:type="spellStart"/>
+            <w:r>
+              <w:rPr>
+                <w:color w:val="000000"/>
+                <w:sz w:val="18"/>
+                <w:szCs w:val="18"/>
+              </w:rPr>
+              <w:t>taskStore</w:t>
+            </w:r>
+            <w:proofErr w:type="spellEnd"/>
+            <w:r>
+              <w:rPr>
+                <w:color w:val="000000"/>
+                <w:sz w:val="18"/>
+                <w:szCs w:val="18"/>
+              </w:rPr>
+              <w:t xml:space="preserve">, </w:t>
+            </w:r>
+            <w:proofErr w:type="spellStart"/>
+            <w:r>
+              <w:rPr>
+                <w:color w:val="000000"/>
+                <w:sz w:val="18"/>
+                <w:szCs w:val="18"/>
+              </w:rPr>
+              <w:t>timerStore</w:t>
+            </w:r>
+            <w:proofErr w:type="spellEnd"/>
+            <w:r>
+              <w:rPr>
+                <w:color w:val="000000"/>
+                <w:sz w:val="18"/>
+                <w:szCs w:val="18"/>
+              </w:rPr>
+              <w:t xml:space="preserve">, </w:t>
+            </w:r>
+            <w:proofErr w:type="spellStart"/>
+            <w:r>
+              <w:rPr>
+                <w:color w:val="000000"/>
+                <w:sz w:val="18"/>
+                <w:szCs w:val="18"/>
+              </w:rPr>
+              <w:t>authStore</w:t>
+            </w:r>
+            <w:proofErr w:type="spellEnd"/>
+            <w:r>
+              <w:rPr>
+                <w:color w:val="000000"/>
+                <w:sz w:val="18"/>
+                <w:szCs w:val="18"/>
+              </w:rPr>
+              <w:t>).</w:t>
             </w:r>
           </w:p>
         </w:tc>
@@ -6517,7 +7099,25 @@
                 <w:sz w:val="18"/>
                 <w:szCs w:val="18"/>
               </w:rPr>
-              <w:t>Não é possível iniciar uma sessão de foco sem uma tarefa selecionada. Toda sessão registrada deve ter um task_id válido.</w:t>
+              <w:t xml:space="preserve">Não é possível iniciar uma sessão de foco sem uma tarefa selecionada. Toda sessão registrada deve ter um </w:t>
+            </w:r>
+            <w:proofErr w:type="spellStart"/>
+            <w:r>
+              <w:rPr>
+                <w:color w:val="000000"/>
+                <w:sz w:val="18"/>
+                <w:szCs w:val="18"/>
+              </w:rPr>
+              <w:t>task_id</w:t>
+            </w:r>
+            <w:proofErr w:type="spellEnd"/>
+            <w:r>
+              <w:rPr>
+                <w:color w:val="000000"/>
+                <w:sz w:val="18"/>
+                <w:szCs w:val="18"/>
+              </w:rPr>
+              <w:t xml:space="preserve"> válido.</w:t>
             </w:r>
           </w:p>
         </w:tc>
@@ -6580,8 +7180,20 @@
                 <w:sz w:val="18"/>
                 <w:szCs w:val="18"/>
               </w:rPr>
-              <w:t>Timer background via timestamp</w:t>
-            </w:r>
+              <w:t xml:space="preserve">Timer background via </w:t>
+            </w:r>
+            <w:proofErr w:type="spellStart"/>
+            <w:r>
+              <w:rPr>
+                <w:b/>
+                <w:bCs/>
+                <w:color w:val="000000"/>
+                <w:sz w:val="18"/>
+                <w:szCs w:val="18"/>
+              </w:rPr>
+              <w:t>timestamp</w:t>
+            </w:r>
+            <w:proofErr w:type="spellEnd"/>
           </w:p>
         </w:tc>
         <w:tc>
@@ -6639,7 +7251,25 @@
                 <w:sz w:val="18"/>
                 <w:szCs w:val="18"/>
               </w:rPr>
-              <w:t>O timer não usa intervalo contínuo em background. O início é salvo como timestamp; o tempo restante é recalculado ao retornar ao app.</w:t>
+              <w:t xml:space="preserve">O timer não usa intervalo contínuo em background. O início é salvo como </w:t>
+            </w:r>
+            <w:proofErr w:type="spellStart"/>
+            <w:r>
+              <w:rPr>
+                <w:color w:val="000000"/>
+                <w:sz w:val="18"/>
+                <w:szCs w:val="18"/>
+              </w:rPr>
+              <w:t>timestamp</w:t>
+            </w:r>
+            <w:proofErr w:type="spellEnd"/>
+            <w:r>
+              <w:rPr>
+                <w:color w:val="000000"/>
+                <w:sz w:val="18"/>
+                <w:szCs w:val="18"/>
+              </w:rPr>
+              <w:t>; o tempo restante é recalculado ao retornar ao app.</w:t>
             </w:r>
           </w:p>
         </w:tc>
@@ -6760,7 +7390,61 @@
                 <w:sz w:val="18"/>
                 <w:szCs w:val="18"/>
               </w:rPr>
-              <w:t>A lógica extraída das stores no Semestre 2 deve ser organizada em Use Cases independentes (ex: CompleteTaskUseCase), consumíveis por Jest sem dependência de framework.</w:t>
+              <w:t>A lógica extraída das stores no Semestre 2 deve ser organizada em Use Cases independentes (</w:t>
+            </w:r>
+            <w:proofErr w:type="spellStart"/>
+            <w:r>
+              <w:rPr>
+                <w:color w:val="000000"/>
+                <w:sz w:val="18"/>
+                <w:szCs w:val="18"/>
+              </w:rPr>
+              <w:t>ex</w:t>
+            </w:r>
+            <w:proofErr w:type="spellEnd"/>
+            <w:r>
+              <w:rPr>
+                <w:color w:val="000000"/>
+                <w:sz w:val="18"/>
+                <w:szCs w:val="18"/>
+              </w:rPr>
+              <w:t xml:space="preserve">: </w:t>
+            </w:r>
+            <w:proofErr w:type="spellStart"/>
+            <w:r>
+              <w:rPr>
+                <w:color w:val="000000"/>
+                <w:sz w:val="18"/>
+                <w:szCs w:val="18"/>
+              </w:rPr>
+              <w:t>CompleteTaskUseCase</w:t>
+            </w:r>
+            <w:proofErr w:type="spellEnd"/>
+            <w:r>
+              <w:rPr>
+                <w:color w:val="000000"/>
+                <w:sz w:val="18"/>
+                <w:szCs w:val="18"/>
+              </w:rPr>
+              <w:t xml:space="preserve">), consumíveis por </w:t>
+            </w:r>
+            <w:proofErr w:type="spellStart"/>
+            <w:r>
+              <w:rPr>
+                <w:color w:val="000000"/>
+                <w:sz w:val="18"/>
+                <w:szCs w:val="18"/>
+              </w:rPr>
+              <w:t>Jest</w:t>
+            </w:r>
+            <w:proofErr w:type="spellEnd"/>
+            <w:r>
+              <w:rPr>
+                <w:color w:val="000000"/>
+                <w:sz w:val="18"/>
+                <w:szCs w:val="18"/>
+              </w:rPr>
+              <w:t xml:space="preserve"> sem dependência de framework.</w:t>
             </w:r>
           </w:p>
         </w:tc>
@@ -6881,7 +7565,43 @@
                 <w:sz w:val="18"/>
                 <w:szCs w:val="18"/>
               </w:rPr>
-              <w:t>O app deve ser publicado na App Store (exige Apple Developer Program pago) e no Google Play ao final do Semestre 2.</w:t>
+              <w:t xml:space="preserve">O app deve ser publicado na App Store (exige Apple </w:t>
+            </w:r>
+            <w:proofErr w:type="spellStart"/>
+            <w:r>
+              <w:rPr>
+                <w:color w:val="000000"/>
+                <w:sz w:val="18"/>
+                <w:szCs w:val="18"/>
+              </w:rPr>
+              <w:t>Developer</w:t>
+            </w:r>
+            <w:proofErr w:type="spellEnd"/>
+            <w:r>
+              <w:rPr>
+                <w:color w:val="000000"/>
+                <w:sz w:val="18"/>
+                <w:szCs w:val="18"/>
+              </w:rPr>
+              <w:t xml:space="preserve"> </w:t>
+            </w:r>
+            <w:proofErr w:type="spellStart"/>
+            <w:r>
+              <w:rPr>
+                <w:color w:val="000000"/>
+                <w:sz w:val="18"/>
+                <w:szCs w:val="18"/>
+              </w:rPr>
+              <w:t>Program</w:t>
+            </w:r>
+            <w:proofErr w:type="spellEnd"/>
+            <w:r>
+              <w:rPr>
+                <w:color w:val="000000"/>
+                <w:sz w:val="18"/>
+                <w:szCs w:val="18"/>
+              </w:rPr>
+              <w:t xml:space="preserve"> pago) e no Google Play ao final do Semestre 2.</w:t>
             </w:r>
           </w:p>
         </w:tc>
@@ -7185,7 +7905,25 @@
                 <w:sz w:val="18"/>
                 <w:szCs w:val="18"/>
               </w:rPr>
-              <w:t>A listagem de tarefas deve carregar em menos de 300ms em dispositivos com SQLite local.</w:t>
+              <w:t xml:space="preserve">A listagem de tarefas deve carregar em menos de 300ms em dispositivos com </w:t>
+            </w:r>
+            <w:proofErr w:type="spellStart"/>
+            <w:r>
+              <w:rPr>
+                <w:color w:val="000000"/>
+                <w:sz w:val="18"/>
+                <w:szCs w:val="18"/>
+              </w:rPr>
+              <w:t>SQLite</w:t>
+            </w:r>
+            <w:proofErr w:type="spellEnd"/>
+            <w:r>
+              <w:rPr>
+                <w:color w:val="000000"/>
+                <w:sz w:val="18"/>
+                <w:szCs w:val="18"/>
+              </w:rPr>
+              <w:t xml:space="preserve"> local.</w:t>
             </w:r>
           </w:p>
         </w:tc>
@@ -7542,7 +8280,61 @@
                 <w:sz w:val="18"/>
                 <w:szCs w:val="18"/>
               </w:rPr>
-              <w:t>Tokens de sessão OAuth devem ser armazenados de forma segura via Expo SecureStore, nunca em AsyncStorage.</w:t>
+              <w:t xml:space="preserve">Tokens de sessão </w:t>
+            </w:r>
+            <w:proofErr w:type="spellStart"/>
+            <w:r>
+              <w:rPr>
+                <w:color w:val="000000"/>
+                <w:sz w:val="18"/>
+                <w:szCs w:val="18"/>
+              </w:rPr>
+              <w:t>OAuth</w:t>
+            </w:r>
+            <w:proofErr w:type="spellEnd"/>
+            <w:r>
+              <w:rPr>
+                <w:color w:val="000000"/>
+                <w:sz w:val="18"/>
+                <w:szCs w:val="18"/>
+              </w:rPr>
+              <w:t xml:space="preserve"> devem ser armazenados de forma segura via Expo </w:t>
+            </w:r>
+            <w:proofErr w:type="spellStart"/>
+            <w:r>
+              <w:rPr>
+                <w:color w:val="000000"/>
+                <w:sz w:val="18"/>
+                <w:szCs w:val="18"/>
+              </w:rPr>
+              <w:t>SecureStore</w:t>
+            </w:r>
+            <w:proofErr w:type="spellEnd"/>
+            <w:r>
+              <w:rPr>
+                <w:color w:val="000000"/>
+                <w:sz w:val="18"/>
+                <w:szCs w:val="18"/>
+              </w:rPr>
+              <w:t xml:space="preserve">, nunca em </w:t>
+            </w:r>
+            <w:proofErr w:type="spellStart"/>
+            <w:r>
+              <w:rPr>
+                <w:color w:val="000000"/>
+                <w:sz w:val="18"/>
+                <w:szCs w:val="18"/>
+              </w:rPr>
+              <w:t>AsyncStorage</w:t>
+            </w:r>
+            <w:proofErr w:type="spellEnd"/>
+            <w:r>
+              <w:rPr>
+                <w:color w:val="000000"/>
+                <w:sz w:val="18"/>
+                <w:szCs w:val="18"/>
+              </w:rPr>
+              <w:t>.</w:t>
             </w:r>
           </w:p>
         </w:tc>
@@ -7661,7 +8453,25 @@
                 <w:sz w:val="18"/>
                 <w:szCs w:val="18"/>
               </w:rPr>
-              <w:t>RLS no Supabase deve garantir que nenhuma query retorne dados de outro usuário, mesmo com token válido.</w:t>
+              <w:t xml:space="preserve">RLS no </w:t>
+            </w:r>
+            <w:proofErr w:type="spellStart"/>
+            <w:r>
+              <w:rPr>
+                <w:color w:val="000000"/>
+                <w:sz w:val="18"/>
+                <w:szCs w:val="18"/>
+              </w:rPr>
+              <w:t>Supabase</w:t>
+            </w:r>
+            <w:proofErr w:type="spellEnd"/>
+            <w:r>
+              <w:rPr>
+                <w:color w:val="000000"/>
+                <w:sz w:val="18"/>
+                <w:szCs w:val="18"/>
+              </w:rPr>
+              <w:t xml:space="preserve"> deve garantir que nenhuma query retorne dados de outro usuário, mesmo com token válido.</w:t>
             </w:r>
           </w:p>
         </w:tc>
@@ -8018,7 +8828,61 @@
                 <w:sz w:val="18"/>
                 <w:szCs w:val="18"/>
               </w:rPr>
-              <w:t>Nenhuma tela deve importar diretamente expo-sqlite ou Supabase SDK. Toda dependência de dados passa pela Camada 03 (hooks).</w:t>
+              <w:t>Nenhuma tela deve importar diretamente expo-</w:t>
+            </w:r>
+            <w:proofErr w:type="spellStart"/>
+            <w:r>
+              <w:rPr>
+                <w:color w:val="000000"/>
+                <w:sz w:val="18"/>
+                <w:szCs w:val="18"/>
+              </w:rPr>
+              <w:t>sqlite</w:t>
+            </w:r>
+            <w:proofErr w:type="spellEnd"/>
+            <w:r>
+              <w:rPr>
+                <w:color w:val="000000"/>
+                <w:sz w:val="18"/>
+                <w:szCs w:val="18"/>
+              </w:rPr>
+              <w:t xml:space="preserve"> ou </w:t>
+            </w:r>
+            <w:proofErr w:type="spellStart"/>
+            <w:r>
+              <w:rPr>
+                <w:color w:val="000000"/>
+                <w:sz w:val="18"/>
+                <w:szCs w:val="18"/>
+              </w:rPr>
+              <w:t>Supabase</w:t>
+            </w:r>
+            <w:proofErr w:type="spellEnd"/>
+            <w:r>
+              <w:rPr>
+                <w:color w:val="000000"/>
+                <w:sz w:val="18"/>
+                <w:szCs w:val="18"/>
+              </w:rPr>
+              <w:t xml:space="preserve"> SDK. Toda dependência de dados passa pela Camada 03 (</w:t>
+            </w:r>
+            <w:proofErr w:type="spellStart"/>
+            <w:r>
+              <w:rPr>
+                <w:color w:val="000000"/>
+                <w:sz w:val="18"/>
+                <w:szCs w:val="18"/>
+              </w:rPr>
+              <w:t>hooks</w:t>
+            </w:r>
+            <w:proofErr w:type="spellEnd"/>
+            <w:r>
+              <w:rPr>
+                <w:color w:val="000000"/>
+                <w:sz w:val="18"/>
+                <w:szCs w:val="18"/>
+              </w:rPr>
+              <w:t>).</w:t>
             </w:r>
           </w:p>
         </w:tc>
@@ -8256,7 +9120,25 @@
                 <w:sz w:val="18"/>
                 <w:szCs w:val="18"/>
               </w:rPr>
-              <w:t>Use Cases extraídos no Semestre 2 devem ser testáveis com Jest puro, sem necessidade de emulador ou dispositivo físico.</w:t>
+              <w:t xml:space="preserve">Use Cases extraídos no Semestre 2 devem ser testáveis com </w:t>
+            </w:r>
+            <w:proofErr w:type="spellStart"/>
+            <w:r>
+              <w:rPr>
+                <w:color w:val="000000"/>
+                <w:sz w:val="18"/>
+                <w:szCs w:val="18"/>
+              </w:rPr>
+              <w:t>Jest</w:t>
+            </w:r>
+            <w:proofErr w:type="spellEnd"/>
+            <w:r>
+              <w:rPr>
+                <w:color w:val="000000"/>
+                <w:sz w:val="18"/>
+                <w:szCs w:val="18"/>
+              </w:rPr>
+              <w:t xml:space="preserve"> puro, sem necessidade de emulador ou dispositivo físico.</w:t>
             </w:r>
           </w:p>
         </w:tc>
@@ -8494,7 +9376,25 @@
                 <w:sz w:val="18"/>
                 <w:szCs w:val="18"/>
               </w:rPr>
-              <w:t>A fila de sync pendente deve ser processada em até 5 segundos após detecção de reconexão à internet.</w:t>
+              <w:t xml:space="preserve">A fila de </w:t>
+            </w:r>
+            <w:proofErr w:type="spellStart"/>
+            <w:r>
+              <w:rPr>
+                <w:color w:val="000000"/>
+                <w:sz w:val="18"/>
+                <w:szCs w:val="18"/>
+              </w:rPr>
+              <w:t>sync</w:t>
+            </w:r>
+            <w:proofErr w:type="spellEnd"/>
+            <w:r>
+              <w:rPr>
+                <w:color w:val="000000"/>
+                <w:sz w:val="18"/>
+                <w:szCs w:val="18"/>
+              </w:rPr>
+              <w:t xml:space="preserve"> pendente deve ser processada em até 5 segundos após detecção de reconexão à internet.</w:t>
             </w:r>
           </w:p>
         </w:tc>
@@ -8524,7 +9424,21 @@
         <w:rPr>
           <w:color w:val="000000"/>
         </w:rPr>
-        <w:t>As restrições são limitações impostas ao projeto pela escolha de stack, prazo acadêmico, políticas das lojas ou decisões arquiteturais deliberadas da equipe.</w:t>
+        <w:t xml:space="preserve">As restrições são limitações impostas ao projeto pela escolha de </w:t>
+      </w:r>
+      <w:proofErr w:type="spellStart"/>
+      <w:r>
+        <w:rPr>
+          <w:color w:val="000000"/>
+        </w:rPr>
+        <w:t>stack</w:t>
+      </w:r>
+      <w:proofErr w:type="spellEnd"/>
+      <w:r>
+        <w:rPr>
+          <w:color w:val="000000"/>
+        </w:rPr>
+        <w:t>, prazo acadêmico, políticas das lojas ou decisões arquiteturais deliberadas da equipe.</w:t>
       </w:r>
     </w:p>
     <w:tbl>
@@ -8800,7 +9714,79 @@
                 <w:sz w:val="18"/>
                 <w:szCs w:val="18"/>
               </w:rPr>
-              <w:t>O projeto deve utilizar exclusivamente Expo SDK 52, React Native e TypeScript. Não é permitido ejetar para bare workflow durante o Semestre 1.</w:t>
+              <w:t xml:space="preserve">O projeto deve utilizar exclusivamente Expo SDK 52, </w:t>
+            </w:r>
+            <w:proofErr w:type="spellStart"/>
+            <w:r>
+              <w:rPr>
+                <w:color w:val="000000"/>
+                <w:sz w:val="18"/>
+                <w:szCs w:val="18"/>
+              </w:rPr>
+              <w:t>React</w:t>
+            </w:r>
+            <w:proofErr w:type="spellEnd"/>
+            <w:r>
+              <w:rPr>
+                <w:color w:val="000000"/>
+                <w:sz w:val="18"/>
+                <w:szCs w:val="18"/>
+              </w:rPr>
+              <w:t xml:space="preserve"> </w:t>
+            </w:r>
+            <w:proofErr w:type="spellStart"/>
+            <w:r>
+              <w:rPr>
+                <w:color w:val="000000"/>
+                <w:sz w:val="18"/>
+                <w:szCs w:val="18"/>
+              </w:rPr>
+              <w:t>Native</w:t>
+            </w:r>
+            <w:proofErr w:type="spellEnd"/>
+            <w:r>
+              <w:rPr>
+                <w:color w:val="000000"/>
+                <w:sz w:val="18"/>
+                <w:szCs w:val="18"/>
+              </w:rPr>
+              <w:t xml:space="preserve"> e </w:t>
+            </w:r>
+            <w:proofErr w:type="spellStart"/>
+            <w:r>
+              <w:rPr>
+                <w:color w:val="000000"/>
+                <w:sz w:val="18"/>
+                <w:szCs w:val="18"/>
+              </w:rPr>
+              <w:t>TypeScript</w:t>
+            </w:r>
+            <w:proofErr w:type="spellEnd"/>
+            <w:r>
+              <w:rPr>
+                <w:color w:val="000000"/>
+                <w:sz w:val="18"/>
+                <w:szCs w:val="18"/>
+              </w:rPr>
+              <w:t xml:space="preserve">. Não é permitido ejetar para </w:t>
+            </w:r>
+            <w:proofErr w:type="spellStart"/>
+            <w:r>
+              <w:rPr>
+                <w:color w:val="000000"/>
+                <w:sz w:val="18"/>
+                <w:szCs w:val="18"/>
+              </w:rPr>
+              <w:t>bare</w:t>
+            </w:r>
+            <w:proofErr w:type="spellEnd"/>
+            <w:r>
+              <w:rPr>
+                <w:color w:val="000000"/>
+                <w:sz w:val="18"/>
+                <w:szCs w:val="18"/>
+              </w:rPr>
+              <w:t xml:space="preserve"> workflow durante o Semestre 1.</w:t>
             </w:r>
           </w:p>
         </w:tc>
@@ -8922,7 +9908,61 @@
                 <w:sz w:val="18"/>
                 <w:szCs w:val="18"/>
               </w:rPr>
-              <w:t>O banco local deve ser SQLite via expo-sqlite 14.x. Não é permitido usar AsyncStorage ou MMKV como banco principal de dados de aplicação.</w:t>
+              <w:t xml:space="preserve">O banco local deve ser </w:t>
+            </w:r>
+            <w:proofErr w:type="spellStart"/>
+            <w:r>
+              <w:rPr>
+                <w:color w:val="000000"/>
+                <w:sz w:val="18"/>
+                <w:szCs w:val="18"/>
+              </w:rPr>
+              <w:t>SQLite</w:t>
+            </w:r>
+            <w:proofErr w:type="spellEnd"/>
+            <w:r>
+              <w:rPr>
+                <w:color w:val="000000"/>
+                <w:sz w:val="18"/>
+                <w:szCs w:val="18"/>
+              </w:rPr>
+              <w:t xml:space="preserve"> via expo-</w:t>
+            </w:r>
+            <w:proofErr w:type="spellStart"/>
+            <w:r>
+              <w:rPr>
+                <w:color w:val="000000"/>
+                <w:sz w:val="18"/>
+                <w:szCs w:val="18"/>
+              </w:rPr>
+              <w:t>sqlite</w:t>
+            </w:r>
+            <w:proofErr w:type="spellEnd"/>
+            <w:r>
+              <w:rPr>
+                <w:color w:val="000000"/>
+                <w:sz w:val="18"/>
+                <w:szCs w:val="18"/>
+              </w:rPr>
+              <w:t xml:space="preserve"> 14.x. Não é permitido usar </w:t>
+            </w:r>
+            <w:proofErr w:type="spellStart"/>
+            <w:r>
+              <w:rPr>
+                <w:color w:val="000000"/>
+                <w:sz w:val="18"/>
+                <w:szCs w:val="18"/>
+              </w:rPr>
+              <w:t>AsyncStorage</w:t>
+            </w:r>
+            <w:proofErr w:type="spellEnd"/>
+            <w:r>
+              <w:rPr>
+                <w:color w:val="000000"/>
+                <w:sz w:val="18"/>
+                <w:szCs w:val="18"/>
+              </w:rPr>
+              <w:t xml:space="preserve"> ou MMKV como banco principal de dados de aplicação.</w:t>
             </w:r>
           </w:p>
         </w:tc>
@@ -8976,16 +10016,40 @@
             </w:tcMar>
           </w:tcPr>
           <w:p>
-            <w:r>
-              <w:rPr>
-                <w:b/>
-                <w:bCs/>
-                <w:color w:val="000000"/>
-                <w:sz w:val="18"/>
-                <w:szCs w:val="18"/>
-              </w:rPr>
-              <w:t>Backend exclusivo Supabase</w:t>
-            </w:r>
+            <w:proofErr w:type="spellStart"/>
+            <w:r>
+              <w:rPr>
+                <w:b/>
+                <w:bCs/>
+                <w:color w:val="000000"/>
+                <w:sz w:val="18"/>
+                <w:szCs w:val="18"/>
+              </w:rPr>
+              <w:t>Backend</w:t>
+            </w:r>
+            <w:proofErr w:type="spellEnd"/>
+            <w:r>
+              <w:rPr>
+                <w:b/>
+                <w:bCs/>
+                <w:color w:val="000000"/>
+                <w:sz w:val="18"/>
+                <w:szCs w:val="18"/>
+              </w:rPr>
+              <w:t xml:space="preserve"> exclusivo </w:t>
+            </w:r>
+            <w:proofErr w:type="spellStart"/>
+            <w:r>
+              <w:rPr>
+                <w:b/>
+                <w:bCs/>
+                <w:color w:val="000000"/>
+                <w:sz w:val="18"/>
+                <w:szCs w:val="18"/>
+              </w:rPr>
+              <w:t>Supabase</w:t>
+            </w:r>
+            <w:proofErr w:type="spellEnd"/>
           </w:p>
         </w:tc>
         <w:tc>
@@ -9043,7 +10107,97 @@
                 <w:sz w:val="18"/>
                 <w:szCs w:val="18"/>
               </w:rPr>
-              <w:t>O backend remoto deve ser exclusivamente Supabase (free tier). Não é permitido adicionar outro servidor ou BaaS no escopo deste projeto.</w:t>
+              <w:t xml:space="preserve">O </w:t>
+            </w:r>
+            <w:proofErr w:type="spellStart"/>
+            <w:r>
+              <w:rPr>
+                <w:color w:val="000000"/>
+                <w:sz w:val="18"/>
+                <w:szCs w:val="18"/>
+              </w:rPr>
+              <w:t>backend</w:t>
+            </w:r>
+            <w:proofErr w:type="spellEnd"/>
+            <w:r>
+              <w:rPr>
+                <w:color w:val="000000"/>
+                <w:sz w:val="18"/>
+                <w:szCs w:val="18"/>
+              </w:rPr>
+              <w:t xml:space="preserve"> remoto deve ser exclusivamente </w:t>
+            </w:r>
+            <w:proofErr w:type="spellStart"/>
+            <w:r>
+              <w:rPr>
+                <w:color w:val="000000"/>
+                <w:sz w:val="18"/>
+                <w:szCs w:val="18"/>
+              </w:rPr>
+              <w:t>Supabase</w:t>
+            </w:r>
+            <w:proofErr w:type="spellEnd"/>
+            <w:r>
+              <w:rPr>
+                <w:color w:val="000000"/>
+                <w:sz w:val="18"/>
+                <w:szCs w:val="18"/>
+              </w:rPr>
+              <w:t xml:space="preserve"> (</w:t>
+            </w:r>
+            <w:proofErr w:type="spellStart"/>
+            <w:r>
+              <w:rPr>
+                <w:color w:val="000000"/>
+                <w:sz w:val="18"/>
+                <w:szCs w:val="18"/>
+              </w:rPr>
+              <w:t>free</w:t>
+            </w:r>
+            <w:proofErr w:type="spellEnd"/>
+            <w:r>
+              <w:rPr>
+                <w:color w:val="000000"/>
+                <w:sz w:val="18"/>
+                <w:szCs w:val="18"/>
+              </w:rPr>
+              <w:t xml:space="preserve"> </w:t>
+            </w:r>
+            <w:proofErr w:type="spellStart"/>
+            <w:r>
+              <w:rPr>
+                <w:color w:val="000000"/>
+                <w:sz w:val="18"/>
+                <w:szCs w:val="18"/>
+              </w:rPr>
+              <w:t>tier</w:t>
+            </w:r>
+            <w:proofErr w:type="spellEnd"/>
+            <w:r>
+              <w:rPr>
+                <w:color w:val="000000"/>
+                <w:sz w:val="18"/>
+                <w:szCs w:val="18"/>
+              </w:rPr>
+              <w:t xml:space="preserve">). Não é permitido adicionar outro servidor ou </w:t>
+            </w:r>
+            <w:proofErr w:type="spellStart"/>
+            <w:r>
+              <w:rPr>
+                <w:color w:val="000000"/>
+                <w:sz w:val="18"/>
+                <w:szCs w:val="18"/>
+              </w:rPr>
+              <w:t>BaaS</w:t>
+            </w:r>
+            <w:proofErr w:type="spellEnd"/>
+            <w:r>
+              <w:rPr>
+                <w:color w:val="000000"/>
+                <w:sz w:val="18"/>
+                <w:szCs w:val="18"/>
+              </w:rPr>
+              <w:t xml:space="preserve"> no escopo deste projeto.</w:t>
             </w:r>
           </w:p>
         </w:tc>
@@ -9164,7 +10318,43 @@
                 <w:sz w:val="18"/>
                 <w:szCs w:val="18"/>
               </w:rPr>
-              <w:t>Não é permitido implementar autenticação por email/senha ou login anônimo. OAuth (Google e Apple) é a única estratégia de autenticação.</w:t>
+              <w:t xml:space="preserve">Não é permitido implementar autenticação por </w:t>
+            </w:r>
+            <w:proofErr w:type="spellStart"/>
+            <w:r>
+              <w:rPr>
+                <w:color w:val="000000"/>
+                <w:sz w:val="18"/>
+                <w:szCs w:val="18"/>
+              </w:rPr>
+              <w:t>email</w:t>
+            </w:r>
+            <w:proofErr w:type="spellEnd"/>
+            <w:r>
+              <w:rPr>
+                <w:color w:val="000000"/>
+                <w:sz w:val="18"/>
+                <w:szCs w:val="18"/>
+              </w:rPr>
+              <w:t xml:space="preserve">/senha ou login anônimo. </w:t>
+            </w:r>
+            <w:proofErr w:type="spellStart"/>
+            <w:r>
+              <w:rPr>
+                <w:color w:val="000000"/>
+                <w:sz w:val="18"/>
+                <w:szCs w:val="18"/>
+              </w:rPr>
+              <w:t>OAuth</w:t>
+            </w:r>
+            <w:proofErr w:type="spellEnd"/>
+            <w:r>
+              <w:rPr>
+                <w:color w:val="000000"/>
+                <w:sz w:val="18"/>
+                <w:szCs w:val="18"/>
+              </w:rPr>
+              <w:t xml:space="preserve"> (Google e Apple) é a única estratégia de autenticação.</w:t>
             </w:r>
           </w:p>
         </w:tc>
@@ -9218,15 +10408,49 @@
             </w:tcMar>
           </w:tcPr>
           <w:p>
-            <w:r>
-              <w:rPr>
-                <w:b/>
-                <w:bCs/>
-                <w:color w:val="000000"/>
-                <w:sz w:val="18"/>
-                <w:szCs w:val="18"/>
-              </w:rPr>
-              <w:t>React Hook Form removido</w:t>
+            <w:proofErr w:type="spellStart"/>
+            <w:r>
+              <w:rPr>
+                <w:b/>
+                <w:bCs/>
+                <w:color w:val="000000"/>
+                <w:sz w:val="18"/>
+                <w:szCs w:val="18"/>
+              </w:rPr>
+              <w:t>React</w:t>
+            </w:r>
+            <w:proofErr w:type="spellEnd"/>
+            <w:r>
+              <w:rPr>
+                <w:b/>
+                <w:bCs/>
+                <w:color w:val="000000"/>
+                <w:sz w:val="18"/>
+                <w:szCs w:val="18"/>
+              </w:rPr>
+              <w:t xml:space="preserve"> Hook </w:t>
+            </w:r>
+            <w:proofErr w:type="spellStart"/>
+            <w:r>
+              <w:rPr>
+                <w:b/>
+                <w:bCs/>
+                <w:color w:val="000000"/>
+                <w:sz w:val="18"/>
+                <w:szCs w:val="18"/>
+              </w:rPr>
+              <w:t>Form</w:t>
+            </w:r>
+            <w:proofErr w:type="spellEnd"/>
+            <w:r>
+              <w:rPr>
+                <w:b/>
+                <w:bCs/>
+                <w:color w:val="000000"/>
+                <w:sz w:val="18"/>
+                <w:szCs w:val="18"/>
+              </w:rPr>
+              <w:t xml:space="preserve"> removido</w:t>
             </w:r>
           </w:p>
         </w:tc>
@@ -9285,7 +10509,43 @@
                 <w:sz w:val="18"/>
                 <w:szCs w:val="18"/>
               </w:rPr>
-              <w:t>O projeto não utiliza React Hook Form. Formulários simples são controlados com useState diretamente.</w:t>
+              <w:t xml:space="preserve">O projeto não utiliza </w:t>
+            </w:r>
+            <w:proofErr w:type="spellStart"/>
+            <w:r>
+              <w:rPr>
+                <w:color w:val="000000"/>
+                <w:sz w:val="18"/>
+                <w:szCs w:val="18"/>
+              </w:rPr>
+              <w:t>React</w:t>
+            </w:r>
+            <w:proofErr w:type="spellEnd"/>
+            <w:r>
+              <w:rPr>
+                <w:color w:val="000000"/>
+                <w:sz w:val="18"/>
+                <w:szCs w:val="18"/>
+              </w:rPr>
+              <w:t xml:space="preserve"> Hook Form. Formulários simples são controlados com </w:t>
+            </w:r>
+            <w:proofErr w:type="spellStart"/>
+            <w:r>
+              <w:rPr>
+                <w:color w:val="000000"/>
+                <w:sz w:val="18"/>
+                <w:szCs w:val="18"/>
+              </w:rPr>
+              <w:t>useState</w:t>
+            </w:r>
+            <w:proofErr w:type="spellEnd"/>
+            <w:r>
+              <w:rPr>
+                <w:color w:val="000000"/>
+                <w:sz w:val="18"/>
+                <w:szCs w:val="18"/>
+              </w:rPr>
+              <w:t xml:space="preserve"> diretamente.</w:t>
             </w:r>
           </w:p>
         </w:tc>
@@ -9416,7 +10676,97 @@
                 <w:sz w:val="18"/>
                 <w:szCs w:val="18"/>
               </w:rPr>
-              <w:t>A navegação deve usar exclusivamente Expo Router 3.x (file-based routing). Não é permitido usar React Navigation diretamente.</w:t>
+              <w:t xml:space="preserve">A navegação deve usar exclusivamente Expo </w:t>
+            </w:r>
+            <w:proofErr w:type="spellStart"/>
+            <w:r>
+              <w:rPr>
+                <w:color w:val="000000"/>
+                <w:sz w:val="18"/>
+                <w:szCs w:val="18"/>
+              </w:rPr>
+              <w:t>Router</w:t>
+            </w:r>
+            <w:proofErr w:type="spellEnd"/>
+            <w:r>
+              <w:rPr>
+                <w:color w:val="000000"/>
+                <w:sz w:val="18"/>
+                <w:szCs w:val="18"/>
+              </w:rPr>
+              <w:t xml:space="preserve"> 3.x (file-</w:t>
+            </w:r>
+            <w:proofErr w:type="spellStart"/>
+            <w:r>
+              <w:rPr>
+                <w:color w:val="000000"/>
+                <w:sz w:val="18"/>
+                <w:szCs w:val="18"/>
+              </w:rPr>
+              <w:t>based</w:t>
+            </w:r>
+            <w:proofErr w:type="spellEnd"/>
+            <w:r>
+              <w:rPr>
+                <w:color w:val="000000"/>
+                <w:sz w:val="18"/>
+                <w:szCs w:val="18"/>
+              </w:rPr>
+              <w:t xml:space="preserve"> </w:t>
+            </w:r>
+            <w:proofErr w:type="spellStart"/>
+            <w:r>
+              <w:rPr>
+                <w:color w:val="000000"/>
+                <w:sz w:val="18"/>
+                <w:szCs w:val="18"/>
+              </w:rPr>
+              <w:t>routing</w:t>
+            </w:r>
+            <w:proofErr w:type="spellEnd"/>
+            <w:r>
+              <w:rPr>
+                <w:color w:val="000000"/>
+                <w:sz w:val="18"/>
+                <w:szCs w:val="18"/>
+              </w:rPr>
+              <w:t xml:space="preserve">). Não é permitido usar </w:t>
+            </w:r>
+            <w:proofErr w:type="spellStart"/>
+            <w:r>
+              <w:rPr>
+                <w:color w:val="000000"/>
+                <w:sz w:val="18"/>
+                <w:szCs w:val="18"/>
+              </w:rPr>
+              <w:t>React</w:t>
+            </w:r>
+            <w:proofErr w:type="spellEnd"/>
+            <w:r>
+              <w:rPr>
+                <w:color w:val="000000"/>
+                <w:sz w:val="18"/>
+                <w:szCs w:val="18"/>
+              </w:rPr>
+              <w:t xml:space="preserve"> </w:t>
+            </w:r>
+            <w:proofErr w:type="spellStart"/>
+            <w:r>
+              <w:rPr>
+                <w:color w:val="000000"/>
+                <w:sz w:val="18"/>
+                <w:szCs w:val="18"/>
+              </w:rPr>
+              <w:t>Navigation</w:t>
+            </w:r>
+            <w:proofErr w:type="spellEnd"/>
+            <w:r>
+              <w:rPr>
+                <w:color w:val="000000"/>
+                <w:sz w:val="18"/>
+                <w:szCs w:val="18"/>
+              </w:rPr>
+              <w:t xml:space="preserve"> diretamente.</w:t>
             </w:r>
           </w:p>
         </w:tc>
@@ -9488,8 +10838,20 @@
                 <w:sz w:val="18"/>
                 <w:szCs w:val="18"/>
               </w:rPr>
-              <w:t>Conta Apple Developer</w:t>
-            </w:r>
+              <w:t xml:space="preserve">Conta Apple </w:t>
+            </w:r>
+            <w:proofErr w:type="spellStart"/>
+            <w:r>
+              <w:rPr>
+                <w:b/>
+                <w:bCs/>
+                <w:color w:val="000000"/>
+                <w:sz w:val="18"/>
+                <w:szCs w:val="18"/>
+              </w:rPr>
+              <w:t>Developer</w:t>
+            </w:r>
+            <w:proofErr w:type="spellEnd"/>
           </w:p>
         </w:tc>
         <w:tc>
@@ -9547,7 +10909,43 @@
                 <w:sz w:val="18"/>
                 <w:szCs w:val="18"/>
               </w:rPr>
-              <w:t>A publicação na App Store exige conta Apple Developer Program paga. Esta restrição é externa e deve ser prevista no planejamento do Semestre 2.</w:t>
+              <w:t xml:space="preserve">A publicação na App Store exige conta Apple </w:t>
+            </w:r>
+            <w:proofErr w:type="spellStart"/>
+            <w:r>
+              <w:rPr>
+                <w:color w:val="000000"/>
+                <w:sz w:val="18"/>
+                <w:szCs w:val="18"/>
+              </w:rPr>
+              <w:t>Developer</w:t>
+            </w:r>
+            <w:proofErr w:type="spellEnd"/>
+            <w:r>
+              <w:rPr>
+                <w:color w:val="000000"/>
+                <w:sz w:val="18"/>
+                <w:szCs w:val="18"/>
+              </w:rPr>
+              <w:t xml:space="preserve"> </w:t>
+            </w:r>
+            <w:proofErr w:type="spellStart"/>
+            <w:r>
+              <w:rPr>
+                <w:color w:val="000000"/>
+                <w:sz w:val="18"/>
+                <w:szCs w:val="18"/>
+              </w:rPr>
+              <w:t>Program</w:t>
+            </w:r>
+            <w:proofErr w:type="spellEnd"/>
+            <w:r>
+              <w:rPr>
+                <w:color w:val="000000"/>
+                <w:sz w:val="18"/>
+                <w:szCs w:val="18"/>
+              </w:rPr>
+              <w:t xml:space="preserve"> paga. Esta restrição é externa e deve ser prevista no planejamento do Semestre 2.</w:t>
             </w:r>
           </w:p>
         </w:tc>
@@ -9822,6 +11220,7 @@
             <w:pPr>
               <w:jc w:val="center"/>
             </w:pPr>
+            <w:proofErr w:type="spellStart"/>
             <w:r>
               <w:rPr>
                 <w:b/>
@@ -9830,7 +11229,18 @@
                 <w:sz w:val="18"/>
                 <w:szCs w:val="18"/>
               </w:rPr>
-              <w:t>Req. Não Funcional</w:t>
+              <w:t>Req</w:t>
+            </w:r>
+            <w:proofErr w:type="spellEnd"/>
+            <w:r>
+              <w:rPr>
+                <w:b/>
+                <w:bCs/>
+                <w:color w:val="FFFFFF"/>
+                <w:sz w:val="18"/>
+                <w:szCs w:val="18"/>
+              </w:rPr>
+              <w:t>. Não Funcional</w:t>
             </w:r>
           </w:p>
         </w:tc>
@@ -10670,15 +12080,529 @@
         </w:pBdr>
       </w:pPr>
       <w:r>
-        <w:t>7. CRITÉRIOS DE ACEITAÇÃO POR SEMESTRE</w:t>
+        <w:t>7</w:t>
+      </w:r>
+      <w:r>
+        <w:t xml:space="preserve">. </w:t>
+      </w:r>
+      <w:r>
+        <w:t>CASOS DE USO</w:t>
       </w:r>
     </w:p>
+    <w:p>
+      <w:pPr>
+        <w:spacing w:after="120"/>
+      </w:pPr>
+      <w:r>
+        <w:rPr>
+          <w:noProof/>
+        </w:rPr>
+        <w:lastRenderedPageBreak/>
+        <w:drawing>
+          <wp:inline distT="0" distB="0" distL="0" distR="0" wp14:anchorId="196D2E36" wp14:editId="51625562">
+            <wp:extent cx="6120130" cy="7044690"/>
+            <wp:effectExtent l="0" t="0" r="1270" b="3810"/>
+            <wp:docPr id="1104568057" name="Imagem 1"/>
+            <wp:cNvGraphicFramePr>
+              <a:graphicFrameLocks xmlns:a="http://schemas.openxmlformats.org/drawingml/2006/main" noChangeAspect="1"/>
+            </wp:cNvGraphicFramePr>
+            <a:graphic xmlns:a="http://schemas.openxmlformats.org/drawingml/2006/main">
+              <a:graphicData uri="http://schemas.openxmlformats.org/drawingml/2006/picture">
+                <pic:pic xmlns:pic="http://schemas.openxmlformats.org/drawingml/2006/picture">
+                  <pic:nvPicPr>
+                    <pic:cNvPr id="1104568057" name="Imagem 1104568057"/>
+                    <pic:cNvPicPr/>
+                  </pic:nvPicPr>
+                  <pic:blipFill>
+                    <a:blip r:embed="rId7">
+                      <a:extLst>
+                        <a:ext uri="{28A0092B-C50C-407E-A947-70E740481C1C}">
+                          <a14:useLocalDpi xmlns:a14="http://schemas.microsoft.com/office/drawing/2010/main" val="0"/>
+                        </a:ext>
+                      </a:extLst>
+                    </a:blip>
+                    <a:stretch>
+                      <a:fillRect/>
+                    </a:stretch>
+                  </pic:blipFill>
+                  <pic:spPr>
+                    <a:xfrm>
+                      <a:off x="0" y="0"/>
+                      <a:ext cx="6120130" cy="7044690"/>
+                    </a:xfrm>
+                    <a:prstGeom prst="rect">
+                      <a:avLst/>
+                    </a:prstGeom>
+                  </pic:spPr>
+                </pic:pic>
+              </a:graphicData>
+            </a:graphic>
+          </wp:inline>
+        </w:drawing>
+      </w:r>
+    </w:p>
+    <w:p>
+      <w:pPr>
+        <w:spacing w:after="120"/>
+      </w:pPr>
+    </w:p>
+    <w:tbl>
+      <w:tblPr>
+        <w:tblW w:w="9360" w:type="dxa"/>
+        <w:tblBorders>
+          <w:top w:val="single" w:sz="4" w:space="0" w:color="auto"/>
+          <w:left w:val="single" w:sz="4" w:space="0" w:color="auto"/>
+          <w:bottom w:val="single" w:sz="4" w:space="0" w:color="auto"/>
+          <w:right w:val="single" w:sz="4" w:space="0" w:color="auto"/>
+          <w:insideH w:val="single" w:sz="4" w:space="0" w:color="auto"/>
+          <w:insideV w:val="single" w:sz="4" w:space="0" w:color="auto"/>
+        </w:tblBorders>
+        <w:tblCellMar>
+          <w:left w:w="10" w:type="dxa"/>
+          <w:right w:w="10" w:type="dxa"/>
+        </w:tblCellMar>
+        <w:tblLook w:val="04A0" w:firstRow="1" w:lastRow="0" w:firstColumn="1" w:lastColumn="0" w:noHBand="0" w:noVBand="1"/>
+      </w:tblPr>
+      <w:tblGrid>
+        <w:gridCol w:w="2200"/>
+        <w:gridCol w:w="7160"/>
+      </w:tblGrid>
+      <w:tr>
+        <w:tc>
+          <w:tcPr>
+            <w:tcW w:w="9360" w:type="dxa"/>
+            <w:gridSpan w:val="2"/>
+            <w:tcBorders>
+              <w:top w:val="single" w:sz="1" w:space="0" w:color="CCCCCC"/>
+              <w:left w:val="single" w:sz="1" w:space="0" w:color="CCCCCC"/>
+              <w:bottom w:val="single" w:sz="1" w:space="0" w:color="CCCCCC"/>
+              <w:right w:val="single" w:sz="1" w:space="0" w:color="CCCCCC"/>
+            </w:tcBorders>
+            <w:shd w:val="clear" w:color="auto" w:fill="1B3A5C"/>
+            <w:tcMar>
+              <w:top w:w="100" w:type="dxa"/>
+              <w:left w:w="160" w:type="dxa"/>
+              <w:bottom w:w="100" w:type="dxa"/>
+              <w:right w:w="160" w:type="dxa"/>
+            </w:tcMar>
+          </w:tcPr>
+          <w:p>
+            <w:r>
+              <w:rPr>
+                <w:b/>
+                <w:bCs/>
+                <w:color w:val="FFFFFF"/>
+              </w:rPr>
+              <w:t xml:space="preserve">UC01 — </w:t>
+            </w:r>
+            <w:proofErr w:type="gramStart"/>
+            <w:r>
+              <w:rPr>
+                <w:b/>
+                <w:bCs/>
+                <w:color w:val="FFFFFF"/>
+              </w:rPr>
+              <w:t xml:space="preserve">Login  </w:t>
+            </w:r>
+            <w:r>
+              <w:rPr>
+                <w:i/>
+                <w:iCs/>
+                <w:color w:val="D6E4F0"/>
+                <w:sz w:val="18"/>
+                <w:szCs w:val="18"/>
+              </w:rPr>
+              <w:t>(</w:t>
+            </w:r>
+            <w:proofErr w:type="gramEnd"/>
+            <w:r>
+              <w:rPr>
+                <w:i/>
+                <w:iCs/>
+                <w:color w:val="D6E4F0"/>
+                <w:sz w:val="18"/>
+                <w:szCs w:val="18"/>
+              </w:rPr>
+              <w:t>exemplo preenchido)</w:t>
+            </w:r>
+          </w:p>
+        </w:tc>
+      </w:tr>
+      <w:tr>
+        <w:tc>
+          <w:tcPr>
+            <w:tcW w:w="2200" w:type="dxa"/>
+            <w:tcBorders>
+              <w:top w:val="single" w:sz="1" w:space="0" w:color="CCCCCC"/>
+              <w:left w:val="single" w:sz="1" w:space="0" w:color="CCCCCC"/>
+              <w:bottom w:val="single" w:sz="1" w:space="0" w:color="CCCCCC"/>
+              <w:right w:val="single" w:sz="1" w:space="0" w:color="CCCCCC"/>
+            </w:tcBorders>
+            <w:shd w:val="clear" w:color="auto" w:fill="D6E4F0"/>
+            <w:tcMar>
+              <w:top w:w="80" w:type="dxa"/>
+              <w:left w:w="120" w:type="dxa"/>
+              <w:bottom w:w="80" w:type="dxa"/>
+              <w:right w:w="120" w:type="dxa"/>
+            </w:tcMar>
+          </w:tcPr>
+          <w:p>
+            <w:r>
+              <w:rPr>
+                <w:b/>
+                <w:bCs/>
+                <w:color w:val="1B3A5C"/>
+              </w:rPr>
+              <w:t>Ator(es)</w:t>
+            </w:r>
+          </w:p>
+        </w:tc>
+        <w:tc>
+          <w:tcPr>
+            <w:tcW w:w="7160" w:type="dxa"/>
+            <w:tcBorders>
+              <w:top w:val="single" w:sz="1" w:space="0" w:color="CCCCCC"/>
+              <w:left w:val="single" w:sz="1" w:space="0" w:color="CCCCCC"/>
+              <w:bottom w:val="single" w:sz="1" w:space="0" w:color="CCCCCC"/>
+              <w:right w:val="single" w:sz="1" w:space="0" w:color="CCCCCC"/>
+            </w:tcBorders>
+            <w:tcMar>
+              <w:top w:w="80" w:type="dxa"/>
+              <w:left w:w="120" w:type="dxa"/>
+              <w:bottom w:w="80" w:type="dxa"/>
+              <w:right w:w="120" w:type="dxa"/>
+            </w:tcMar>
+          </w:tcPr>
+          <w:p>
+            <w:r>
+              <w:t>Usuário não autenticado</w:t>
+            </w:r>
+          </w:p>
+        </w:tc>
+      </w:tr>
+      <w:tr>
+        <w:tc>
+          <w:tcPr>
+            <w:tcW w:w="2200" w:type="dxa"/>
+            <w:tcBorders>
+              <w:top w:val="single" w:sz="1" w:space="0" w:color="CCCCCC"/>
+              <w:left w:val="single" w:sz="1" w:space="0" w:color="CCCCCC"/>
+              <w:bottom w:val="single" w:sz="1" w:space="0" w:color="CCCCCC"/>
+              <w:right w:val="single" w:sz="1" w:space="0" w:color="CCCCCC"/>
+            </w:tcBorders>
+            <w:shd w:val="clear" w:color="auto" w:fill="D6E4F0"/>
+            <w:tcMar>
+              <w:top w:w="80" w:type="dxa"/>
+              <w:left w:w="120" w:type="dxa"/>
+              <w:bottom w:w="80" w:type="dxa"/>
+              <w:right w:w="120" w:type="dxa"/>
+            </w:tcMar>
+          </w:tcPr>
+          <w:p>
+            <w:r>
+              <w:rPr>
+                <w:b/>
+                <w:bCs/>
+                <w:color w:val="1B3A5C"/>
+              </w:rPr>
+              <w:t>Pré-condição</w:t>
+            </w:r>
+          </w:p>
+        </w:tc>
+        <w:tc>
+          <w:tcPr>
+            <w:tcW w:w="7160" w:type="dxa"/>
+            <w:tcBorders>
+              <w:top w:val="single" w:sz="1" w:space="0" w:color="CCCCCC"/>
+              <w:left w:val="single" w:sz="1" w:space="0" w:color="CCCCCC"/>
+              <w:bottom w:val="single" w:sz="1" w:space="0" w:color="CCCCCC"/>
+              <w:right w:val="single" w:sz="1" w:space="0" w:color="CCCCCC"/>
+            </w:tcBorders>
+            <w:tcMar>
+              <w:top w:w="80" w:type="dxa"/>
+              <w:left w:w="120" w:type="dxa"/>
+              <w:bottom w:w="80" w:type="dxa"/>
+              <w:right w:w="120" w:type="dxa"/>
+            </w:tcMar>
+          </w:tcPr>
+          <w:p>
+            <w:r>
+              <w:t>O usuário já possui conta cadastrada no sistema</w:t>
+            </w:r>
+          </w:p>
+        </w:tc>
+      </w:tr>
+      <w:tr>
+        <w:tc>
+          <w:tcPr>
+            <w:tcW w:w="2200" w:type="dxa"/>
+            <w:tcBorders>
+              <w:top w:val="single" w:sz="1" w:space="0" w:color="CCCCCC"/>
+              <w:left w:val="single" w:sz="1" w:space="0" w:color="CCCCCC"/>
+              <w:bottom w:val="single" w:sz="1" w:space="0" w:color="CCCCCC"/>
+              <w:right w:val="single" w:sz="1" w:space="0" w:color="CCCCCC"/>
+            </w:tcBorders>
+            <w:shd w:val="clear" w:color="auto" w:fill="D6E4F0"/>
+            <w:tcMar>
+              <w:top w:w="80" w:type="dxa"/>
+              <w:left w:w="120" w:type="dxa"/>
+              <w:bottom w:w="80" w:type="dxa"/>
+              <w:right w:w="120" w:type="dxa"/>
+            </w:tcMar>
+          </w:tcPr>
+          <w:p>
+            <w:r>
+              <w:rPr>
+                <w:b/>
+                <w:bCs/>
+                <w:color w:val="1B3A5C"/>
+              </w:rPr>
+              <w:t>Fluxo Principal</w:t>
+            </w:r>
+          </w:p>
+        </w:tc>
+        <w:tc>
+          <w:tcPr>
+            <w:tcW w:w="7160" w:type="dxa"/>
+            <w:tcBorders>
+              <w:top w:val="single" w:sz="1" w:space="0" w:color="CCCCCC"/>
+              <w:left w:val="single" w:sz="1" w:space="0" w:color="CCCCCC"/>
+              <w:bottom w:val="single" w:sz="1" w:space="0" w:color="CCCCCC"/>
+              <w:right w:val="single" w:sz="1" w:space="0" w:color="CCCCCC"/>
+            </w:tcBorders>
+            <w:tcMar>
+              <w:top w:w="80" w:type="dxa"/>
+              <w:left w:w="120" w:type="dxa"/>
+              <w:bottom w:w="80" w:type="dxa"/>
+              <w:right w:w="120" w:type="dxa"/>
+            </w:tcMar>
+          </w:tcPr>
+          <w:p>
+            <w:r>
+              <w:t>1. Usuário acessa a tela de login</w:t>
+            </w:r>
+          </w:p>
+          <w:p>
+            <w:r>
+              <w:t>2. Informa e-mail e senha</w:t>
+            </w:r>
+          </w:p>
+          <w:p>
+            <w:r>
+              <w:t>3. Sistema valida as credenciais</w:t>
+            </w:r>
+          </w:p>
+          <w:p>
+            <w:r>
+              <w:t>4. Usuário é redirecionado ao Dashboard</w:t>
+            </w:r>
+          </w:p>
+        </w:tc>
+      </w:tr>
+      <w:tr>
+        <w:tc>
+          <w:tcPr>
+            <w:tcW w:w="2200" w:type="dxa"/>
+            <w:tcBorders>
+              <w:top w:val="single" w:sz="1" w:space="0" w:color="CCCCCC"/>
+              <w:left w:val="single" w:sz="1" w:space="0" w:color="CCCCCC"/>
+              <w:bottom w:val="single" w:sz="1" w:space="0" w:color="CCCCCC"/>
+              <w:right w:val="single" w:sz="1" w:space="0" w:color="CCCCCC"/>
+            </w:tcBorders>
+            <w:shd w:val="clear" w:color="auto" w:fill="D6E4F0"/>
+            <w:tcMar>
+              <w:top w:w="80" w:type="dxa"/>
+              <w:left w:w="120" w:type="dxa"/>
+              <w:bottom w:w="80" w:type="dxa"/>
+              <w:right w:w="120" w:type="dxa"/>
+            </w:tcMar>
+          </w:tcPr>
+          <w:p>
+            <w:r>
+              <w:rPr>
+                <w:b/>
+                <w:bCs/>
+                <w:color w:val="1B3A5C"/>
+              </w:rPr>
+              <w:t>Fluxo Alternativo</w:t>
+            </w:r>
+          </w:p>
+        </w:tc>
+        <w:tc>
+          <w:tcPr>
+            <w:tcW w:w="7160" w:type="dxa"/>
+            <w:tcBorders>
+              <w:top w:val="single" w:sz="1" w:space="0" w:color="CCCCCC"/>
+              <w:left w:val="single" w:sz="1" w:space="0" w:color="CCCCCC"/>
+              <w:bottom w:val="single" w:sz="1" w:space="0" w:color="CCCCCC"/>
+              <w:right w:val="single" w:sz="1" w:space="0" w:color="CCCCCC"/>
+            </w:tcBorders>
+            <w:tcMar>
+              <w:top w:w="80" w:type="dxa"/>
+              <w:left w:w="120" w:type="dxa"/>
+              <w:bottom w:w="80" w:type="dxa"/>
+              <w:right w:w="120" w:type="dxa"/>
+            </w:tcMar>
+          </w:tcPr>
+          <w:p>
+            <w:r>
+              <w:t>3a. Credenciais inválidas → sistema exibe mensagem de erro e mantém o usuário na tela</w:t>
+            </w:r>
+          </w:p>
+        </w:tc>
+      </w:tr>
+      <w:tr>
+        <w:tc>
+          <w:tcPr>
+            <w:tcW w:w="2200" w:type="dxa"/>
+            <w:tcBorders>
+              <w:top w:val="single" w:sz="1" w:space="0" w:color="CCCCCC"/>
+              <w:left w:val="single" w:sz="1" w:space="0" w:color="CCCCCC"/>
+              <w:bottom w:val="single" w:sz="1" w:space="0" w:color="CCCCCC"/>
+              <w:right w:val="single" w:sz="1" w:space="0" w:color="CCCCCC"/>
+            </w:tcBorders>
+            <w:shd w:val="clear" w:color="auto" w:fill="D6E4F0"/>
+            <w:tcMar>
+              <w:top w:w="80" w:type="dxa"/>
+              <w:left w:w="120" w:type="dxa"/>
+              <w:bottom w:w="80" w:type="dxa"/>
+              <w:right w:w="120" w:type="dxa"/>
+            </w:tcMar>
+          </w:tcPr>
+          <w:p>
+            <w:r>
+              <w:rPr>
+                <w:b/>
+                <w:bCs/>
+                <w:color w:val="1B3A5C"/>
+              </w:rPr>
+              <w:lastRenderedPageBreak/>
+              <w:t>Pós-condição</w:t>
+            </w:r>
+          </w:p>
+        </w:tc>
+        <w:tc>
+          <w:tcPr>
+            <w:tcW w:w="7160" w:type="dxa"/>
+            <w:tcBorders>
+              <w:top w:val="single" w:sz="1" w:space="0" w:color="CCCCCC"/>
+              <w:left w:val="single" w:sz="1" w:space="0" w:color="CCCCCC"/>
+              <w:bottom w:val="single" w:sz="1" w:space="0" w:color="CCCCCC"/>
+              <w:right w:val="single" w:sz="1" w:space="0" w:color="CCCCCC"/>
+            </w:tcBorders>
+            <w:tcMar>
+              <w:top w:w="80" w:type="dxa"/>
+              <w:left w:w="120" w:type="dxa"/>
+              <w:bottom w:w="80" w:type="dxa"/>
+              <w:right w:w="120" w:type="dxa"/>
+            </w:tcMar>
+          </w:tcPr>
+          <w:p>
+            <w:r>
+              <w:t>Sessão do usuário iniciada com token de autenticação válido</w:t>
+            </w:r>
+          </w:p>
+        </w:tc>
+      </w:tr>
+      <w:tr>
+        <w:tc>
+          <w:tcPr>
+            <w:tcW w:w="2200" w:type="dxa"/>
+            <w:tcBorders>
+              <w:top w:val="single" w:sz="1" w:space="0" w:color="CCCCCC"/>
+              <w:left w:val="single" w:sz="1" w:space="0" w:color="CCCCCC"/>
+              <w:bottom w:val="single" w:sz="1" w:space="0" w:color="CCCCCC"/>
+              <w:right w:val="single" w:sz="1" w:space="0" w:color="CCCCCC"/>
+            </w:tcBorders>
+            <w:shd w:val="clear" w:color="auto" w:fill="D6E4F0"/>
+            <w:tcMar>
+              <w:top w:w="80" w:type="dxa"/>
+              <w:left w:w="120" w:type="dxa"/>
+              <w:bottom w:w="80" w:type="dxa"/>
+              <w:right w:w="120" w:type="dxa"/>
+            </w:tcMar>
+          </w:tcPr>
+          <w:p>
+            <w:r>
+              <w:rPr>
+                <w:b/>
+                <w:bCs/>
+                <w:color w:val="1B3A5C"/>
+              </w:rPr>
+              <w:t>Regras Relacionadas</w:t>
+            </w:r>
+          </w:p>
+        </w:tc>
+        <w:tc>
+          <w:tcPr>
+            <w:tcW w:w="7160" w:type="dxa"/>
+            <w:tcBorders>
+              <w:top w:val="single" w:sz="1" w:space="0" w:color="CCCCCC"/>
+              <w:left w:val="single" w:sz="1" w:space="0" w:color="CCCCCC"/>
+              <w:bottom w:val="single" w:sz="1" w:space="0" w:color="CCCCCC"/>
+              <w:right w:val="single" w:sz="1" w:space="0" w:color="CCCCCC"/>
+            </w:tcBorders>
+            <w:tcMar>
+              <w:top w:w="80" w:type="dxa"/>
+              <w:left w:w="120" w:type="dxa"/>
+              <w:bottom w:w="80" w:type="dxa"/>
+              <w:right w:w="120" w:type="dxa"/>
+            </w:tcMar>
+          </w:tcPr>
+          <w:p>
+            <w:r>
+              <w:t>RN01, RN02</w:t>
+            </w:r>
+          </w:p>
+        </w:tc>
+      </w:tr>
+    </w:tbl>
+    <w:p>
+      <w:pPr>
+        <w:spacing w:after="120"/>
+      </w:pPr>
+    </w:p>
+    <w:p>
+      <w:pPr>
+        <w:pStyle w:val="Ttulo1"/>
+        <w:pBdr>
+          <w:bottom w:val="single" w:sz="8" w:space="4" w:color="1B3A6B"/>
+        </w:pBdr>
+      </w:pPr>
+      <w:bookmarkStart w:id="0" w:name="OLE_LINK1"/>
+      <w:r>
+        <w:t>8</w:t>
+      </w:r>
+      <w:r>
+        <w:t>. CRITÉRIOS DE ACEITAÇÃO POR SEMESTRE</w:t>
+      </w:r>
+    </w:p>
+    <w:bookmarkEnd w:id="0"/>
     <w:p>
       <w:pPr>
         <w:pStyle w:val="Ttulo2"/>
       </w:pPr>
       <w:r>
-        <w:t>7.1 Semestre 1 (Março a Junho 2026)</w:t>
+        <w:t>8</w:t>
+      </w:r>
+      <w:r>
+        <w:t>.1 Semestre 1 (</w:t>
+      </w:r>
+      <w:proofErr w:type="gramStart"/>
+      <w:r>
+        <w:t>Março</w:t>
+      </w:r>
+      <w:proofErr w:type="gramEnd"/>
+      <w:r>
+        <w:t xml:space="preserve"> a </w:t>
+      </w:r>
+      <w:proofErr w:type="gramStart"/>
+      <w:r>
+        <w:t>Junho</w:t>
+      </w:r>
+      <w:proofErr w:type="gramEnd"/>
+      <w:r>
+        <w:t xml:space="preserve"> 2026)</w:t>
       </w:r>
     </w:p>
     <w:p>
@@ -10704,7 +12628,15 @@
         <w:spacing w:before="40" w:after="40"/>
       </w:pPr>
       <w:r>
-        <w:t>CRUD de tarefas funciona localmente e sincroniza com Supabase (RF-05 a RF-10)</w:t>
+        <w:t xml:space="preserve">CRUD de tarefas funciona localmente e sincroniza com </w:t>
+      </w:r>
+      <w:proofErr w:type="spellStart"/>
+      <w:r>
+        <w:t>Supabase</w:t>
+      </w:r>
+      <w:proofErr w:type="spellEnd"/>
+      <w:r>
+        <w:t xml:space="preserve"> (RF-05 a RF-10)</w:t>
       </w:r>
     </w:p>
     <w:p>
@@ -10769,7 +12701,10 @@
         <w:pStyle w:val="Ttulo2"/>
       </w:pPr>
       <w:r>
-        <w:t>7.2 Semestre 2 (2º Semestre 2026)</w:t>
+        <w:t>8</w:t>
+      </w:r>
+      <w:r>
+        <w:t>.2 Semestre 2 (2º Semestre 2026)</w:t>
       </w:r>
     </w:p>
     <w:p>
@@ -10834,7 +12769,6 @@
         <w:spacing w:before="40" w:after="40"/>
       </w:pPr>
       <w:r>
-        <w:lastRenderedPageBreak/>
         <w:t>Documentação técnica completa entregue</w:t>
       </w:r>
     </w:p>
@@ -10851,18 +12785,92 @@
         <w:spacing w:before="200"/>
         <w:jc w:val="center"/>
       </w:pPr>
+      <w:proofErr w:type="spellStart"/>
+      <w:proofErr w:type="gramStart"/>
       <w:r>
         <w:rPr>
           <w:color w:val="888888"/>
           <w:sz w:val="16"/>
           <w:szCs w:val="16"/>
         </w:rPr>
-        <w:t>TaskFlow  ·  Documento de Requisitos v1.0  ·  Março 2026  ·  Micael, Murilo, Paulo, Pedro e Vinícius O.</w:t>
+        <w:t>TaskFlow</w:t>
+      </w:r>
+      <w:proofErr w:type="spellEnd"/>
+      <w:r>
+        <w:rPr>
+          <w:color w:val="888888"/>
+          <w:sz w:val="16"/>
+          <w:szCs w:val="16"/>
+        </w:rPr>
+        <w:t xml:space="preserve">  ·</w:t>
+      </w:r>
+      <w:proofErr w:type="gramEnd"/>
+      <w:r>
+        <w:rPr>
+          <w:color w:val="888888"/>
+          <w:sz w:val="16"/>
+          <w:szCs w:val="16"/>
+        </w:rPr>
+        <w:t xml:space="preserve">  Documento de Requisitos </w:t>
+      </w:r>
+      <w:proofErr w:type="gramStart"/>
+      <w:r>
+        <w:rPr>
+          <w:color w:val="888888"/>
+          <w:sz w:val="16"/>
+          <w:szCs w:val="16"/>
+        </w:rPr>
+        <w:t>v1.0  ·</w:t>
+      </w:r>
+      <w:proofErr w:type="gramEnd"/>
+      <w:r>
+        <w:rPr>
+          <w:color w:val="888888"/>
+          <w:sz w:val="16"/>
+          <w:szCs w:val="16"/>
+        </w:rPr>
+        <w:t xml:space="preserve">  </w:t>
+      </w:r>
+      <w:proofErr w:type="gramStart"/>
+      <w:r>
+        <w:rPr>
+          <w:color w:val="888888"/>
+          <w:sz w:val="16"/>
+          <w:szCs w:val="16"/>
+        </w:rPr>
+        <w:t>Março</w:t>
+      </w:r>
+      <w:proofErr w:type="gramEnd"/>
+      <w:r>
+        <w:rPr>
+          <w:color w:val="888888"/>
+          <w:sz w:val="16"/>
+          <w:szCs w:val="16"/>
+        </w:rPr>
+        <w:t xml:space="preserve"> </w:t>
+      </w:r>
+      <w:proofErr w:type="gramStart"/>
+      <w:r>
+        <w:rPr>
+          <w:color w:val="888888"/>
+          <w:sz w:val="16"/>
+          <w:szCs w:val="16"/>
+        </w:rPr>
+        <w:t>2026  ·</w:t>
+      </w:r>
+      <w:proofErr w:type="gramEnd"/>
+      <w:r>
+        <w:rPr>
+          <w:color w:val="888888"/>
+          <w:sz w:val="16"/>
+          <w:szCs w:val="16"/>
+        </w:rPr>
+        <w:t xml:space="preserve">  Micael, Murilo, Paulo, Pedro e Vinícius O.</w:t>
       </w:r>
     </w:p>
     <w:sectPr>
-      <w:headerReference w:type="default" r:id="rId7"/>
-      <w:footerReference w:type="default" r:id="rId8"/>
+      <w:headerReference w:type="default" r:id="rId8"/>
+      <w:footerReference w:type="default" r:id="rId9"/>
       <w:pgSz w:w="11906" w:h="16838"/>
       <w:pgMar w:top="1134" w:right="1134" w:bottom="1134" w:left="1134" w:header="708" w:footer="708" w:gutter="0"/>
       <w:cols w:space="720"/>
@@ -10960,13 +12968,69 @@
       </w:pBdr>
       <w:spacing w:after="80"/>
     </w:pPr>
+    <w:proofErr w:type="spellStart"/>
+    <w:proofErr w:type="gramStart"/>
     <w:r>
       <w:rPr>
         <w:color w:val="888888"/>
         <w:sz w:val="16"/>
         <w:szCs w:val="16"/>
       </w:rPr>
-      <w:t>TaskFlow  ·  Documento de Requisitos  ·  v1.0  ·  UCB 2026</w:t>
+      <w:t>TaskFlow</w:t>
+    </w:r>
+    <w:proofErr w:type="spellEnd"/>
+    <w:r>
+      <w:rPr>
+        <w:color w:val="888888"/>
+        <w:sz w:val="16"/>
+        <w:szCs w:val="16"/>
+      </w:rPr>
+      <w:t xml:space="preserve">  ·</w:t>
+    </w:r>
+    <w:proofErr w:type="gramEnd"/>
+    <w:r>
+      <w:rPr>
+        <w:color w:val="888888"/>
+        <w:sz w:val="16"/>
+        <w:szCs w:val="16"/>
+      </w:rPr>
+      <w:t xml:space="preserve">  Documento de </w:t>
+    </w:r>
+    <w:proofErr w:type="gramStart"/>
+    <w:r>
+      <w:rPr>
+        <w:color w:val="888888"/>
+        <w:sz w:val="16"/>
+        <w:szCs w:val="16"/>
+      </w:rPr>
+      <w:t>Requisitos  ·</w:t>
+    </w:r>
+    <w:proofErr w:type="gramEnd"/>
+    <w:r>
+      <w:rPr>
+        <w:color w:val="888888"/>
+        <w:sz w:val="16"/>
+        <w:szCs w:val="16"/>
+      </w:rPr>
+      <w:t xml:space="preserve">  </w:t>
+    </w:r>
+    <w:proofErr w:type="gramStart"/>
+    <w:r>
+      <w:rPr>
+        <w:color w:val="888888"/>
+        <w:sz w:val="16"/>
+        <w:szCs w:val="16"/>
+      </w:rPr>
+      <w:t>v1.0  ·</w:t>
+    </w:r>
+    <w:proofErr w:type="gramEnd"/>
+    <w:r>
+      <w:rPr>
+        <w:color w:val="888888"/>
+        <w:sz w:val="16"/>
+        <w:szCs w:val="16"/>
+      </w:rPr>
+      <w:t xml:space="preserve">  UCB 2026</w:t>
     </w:r>
   </w:p>
 </w:hdr>
@@ -11524,6 +13588,7 @@
   </w:style>
   <w:style w:type="paragraph" w:styleId="Ttulo1">
     <w:name w:val="heading 1"/>
+    <w:link w:val="Ttulo1Char"/>
     <w:uiPriority w:val="9"/>
     <w:qFormat/>
     <w:pPr>
@@ -11693,6 +13758,20 @@
     <w:rPr>
       <w:sz w:val="20"/>
       <w:szCs w:val="20"/>
+    </w:rPr>
+  </w:style>
+  <w:style w:type="character" w:customStyle="1" w:styleId="Ttulo1Char">
+    <w:name w:val="Título 1 Char"/>
+    <w:basedOn w:val="Fontepargpadro"/>
+    <w:link w:val="Ttulo1"/>
+    <w:uiPriority w:val="9"/>
+    <w:rsid w:val="003B0510"/>
+    <w:rPr>
+      <w:b/>
+      <w:bCs/>
+      <w:color w:val="1B3A6B"/>
+      <w:sz w:val="28"/>
+      <w:szCs w:val="28"/>
     </w:rPr>
   </w:style>
 </w:styles>

</xml_diff>